<commit_message>
docs(fintech-report): README 保留 doc 全部 22 张截图并重导 Word
从 src/新建 DOC 文档.doc 的 OLE Data 流提取全部 22 张 PNG 截图
（1920x915 平台操作截图），按语义命名存 docs/images/：
- entry-1~4: 平台入口（自动上报管理/定时任务/数据管理/实例列表入口）
- add-*: 新增实例场景 7 张（列表新增/填写保存/定时任务/立即执行）
- pbc-*: 人行管理平台侧 6 张（批次组/提交入库申请/处理结果）
- edit-*: 修改场景 2 张；del-*: 删除场景 3 张

README 对应章节插入图注引用（§2 入口 4 张、§4.1 新增+人行平台 13 张、
§4.2 修改 2 张、§4.3 删除 3 张）。

Word 重导：4.4MB，22 张截图全部嵌入（media 验证），16 表格 60 段落。

Co-Authored-By: Claude <noreply@anthropic.com>
</commit_message>
<xml_diff>
--- a/apps/fintech-report/人行金融数据上报-操作与实施手册.docx
+++ b/apps/fintech-report/人行金融数据上报-操作与实施手册.docx
@@ -591,6 +591,162 @@
     </w:p>
     <w:p>
       <w:pPr>
+        <w:spacing w:line="240" w:before="0" w:after="0" w:lineRule="auto"/>
+      </w:pPr>
+      <w:r>
+        <w:rPr/>
+        <w:drawing>
+          <wp:inline distB="0" distL="0" distR="0" distT="0">
+            <wp:extent cx="5753100" cy="2741712"/>
+            <wp:effectExtent b="0" l="0" r="0" t="0"/>
+            <wp:docPr id="1" name="image-GG0RYx8IJmubWWpgc17kP.png"/>
+            <a:graphic>
+              <a:graphicData uri="http://schemas.openxmlformats.org/drawingml/2006/picture">
+                <pic:pic>
+                  <pic:nvPicPr>
+                    <pic:cNvPr id="1" name="image-GG0RYx8IJmubWWpgc17kP.png" descr="平台入口-自动上报管理"/>
+                    <pic:cNvPicPr/>
+                  </pic:nvPicPr>
+                  <pic:blipFill>
+                    <a:blip r:embed="rId6" cstate="print"/>
+                    <a:srcRect b="0" l="0" r="0" t="0"/>
+                    <a:stretch>
+                      <a:fillRect/>
+                    </a:stretch>
+                  </pic:blipFill>
+                  <pic:spPr>
+                    <a:xfrm>
+                      <a:off x="0" y="0"/>
+                      <a:ext cx="5753100" cy="2741712"/>
+                    </a:xfrm>
+                    <a:prstGeom prst="rect"/>
+                  </pic:spPr>
+                </pic:pic>
+              </a:graphicData>
+            </a:graphic>
+          </wp:inline>
+        </w:drawing>
+      </w:r>
+    </w:p>
+    <w:p>
+      <w:pPr>
+        <w:spacing w:line="240" w:before="0" w:after="0" w:lineRule="auto"/>
+      </w:pPr>
+      <w:r>
+        <w:rPr/>
+        <w:drawing>
+          <wp:inline distB="0" distL="0" distR="0" distT="0">
+            <wp:extent cx="5753100" cy="2753697"/>
+            <wp:effectExtent b="0" l="0" r="0" t="0"/>
+            <wp:docPr id="2" name="image-13aAflLXyKAGgU0E-f_nc.png"/>
+            <a:graphic>
+              <a:graphicData uri="http://schemas.openxmlformats.org/drawingml/2006/picture">
+                <pic:pic>
+                  <pic:nvPicPr>
+                    <pic:cNvPr id="2" name="image-13aAflLXyKAGgU0E-f_nc.png" descr="平台入口-定时任务"/>
+                    <pic:cNvPicPr/>
+                  </pic:nvPicPr>
+                  <pic:blipFill>
+                    <a:blip r:embed="rId7" cstate="print"/>
+                    <a:srcRect b="0" l="0" r="0" t="0"/>
+                    <a:stretch>
+                      <a:fillRect/>
+                    </a:stretch>
+                  </pic:blipFill>
+                  <pic:spPr>
+                    <a:xfrm>
+                      <a:off x="0" y="0"/>
+                      <a:ext cx="5753100" cy="2753697"/>
+                    </a:xfrm>
+                    <a:prstGeom prst="rect"/>
+                  </pic:spPr>
+                </pic:pic>
+              </a:graphicData>
+            </a:graphic>
+          </wp:inline>
+        </w:drawing>
+      </w:r>
+    </w:p>
+    <w:p>
+      <w:pPr>
+        <w:spacing w:line="240" w:before="0" w:after="0" w:lineRule="auto"/>
+      </w:pPr>
+      <w:r>
+        <w:rPr/>
+        <w:drawing>
+          <wp:inline distB="0" distL="0" distR="0" distT="0">
+            <wp:extent cx="5753100" cy="2753697"/>
+            <wp:effectExtent b="0" l="0" r="0" t="0"/>
+            <wp:docPr id="3" name="image-JKhhr254nZ2RsQ0akTYbn.png"/>
+            <a:graphic>
+              <a:graphicData uri="http://schemas.openxmlformats.org/drawingml/2006/picture">
+                <pic:pic>
+                  <pic:nvPicPr>
+                    <pic:cNvPr id="3" name="image-JKhhr254nZ2RsQ0akTYbn.png" descr="平台入口-数据管理"/>
+                    <pic:cNvPicPr/>
+                  </pic:nvPicPr>
+                  <pic:blipFill>
+                    <a:blip r:embed="rId8" cstate="print"/>
+                    <a:srcRect b="0" l="0" r="0" t="0"/>
+                    <a:stretch>
+                      <a:fillRect/>
+                    </a:stretch>
+                  </pic:blipFill>
+                  <pic:spPr>
+                    <a:xfrm>
+                      <a:off x="0" y="0"/>
+                      <a:ext cx="5753100" cy="2753697"/>
+                    </a:xfrm>
+                    <a:prstGeom prst="rect"/>
+                  </pic:spPr>
+                </pic:pic>
+              </a:graphicData>
+            </a:graphic>
+          </wp:inline>
+        </w:drawing>
+      </w:r>
+    </w:p>
+    <w:p>
+      <w:pPr>
+        <w:spacing w:line="240" w:before="0" w:after="0" w:lineRule="auto"/>
+      </w:pPr>
+      <w:r>
+        <w:rPr/>
+        <w:drawing>
+          <wp:inline distB="0" distL="0" distR="0" distT="0">
+            <wp:extent cx="5753100" cy="2753697"/>
+            <wp:effectExtent b="0" l="0" r="0" t="0"/>
+            <wp:docPr id="4" name="image-L34D3BZR-X5SU_2AJgGc_.png"/>
+            <a:graphic>
+              <a:graphicData uri="http://schemas.openxmlformats.org/drawingml/2006/picture">
+                <pic:pic>
+                  <pic:nvPicPr>
+                    <pic:cNvPr id="4" name="image-L34D3BZR-X5SU_2AJgGc_.png" descr="人行上报实例列表入口"/>
+                    <pic:cNvPicPr/>
+                  </pic:nvPicPr>
+                  <pic:blipFill>
+                    <a:blip r:embed="rId9" cstate="print"/>
+                    <a:srcRect b="0" l="0" r="0" t="0"/>
+                    <a:stretch>
+                      <a:fillRect/>
+                    </a:stretch>
+                  </pic:blipFill>
+                  <pic:spPr>
+                    <a:xfrm>
+                      <a:off x="0" y="0"/>
+                      <a:ext cx="5753100" cy="2753697"/>
+                    </a:xfrm>
+                    <a:prstGeom prst="rect"/>
+                  </pic:spPr>
+                </pic:pic>
+              </a:graphicData>
+            </a:graphic>
+          </wp:inline>
+        </w:drawing>
+      </w:r>
+    </w:p>
+    <w:p>
+      <w:pPr>
         <w:pStyle w:val="Heading2"/>
         <w:numPr>
           <w:ilvl w:val="1"/>
@@ -1332,6 +1488,528 @@
     </w:p>
     <w:p>
       <w:pPr>
+        <w:spacing w:line="240" w:before="0" w:after="0" w:lineRule="auto"/>
+      </w:pPr>
+      <w:r>
+        <w:rPr/>
+        <w:drawing>
+          <wp:inline distB="0" distL="0" distR="0" distT="0">
+            <wp:extent cx="5753100" cy="2753697"/>
+            <wp:effectExtent b="0" l="0" r="0" t="0"/>
+            <wp:docPr id="5" name="image-scZbTrQqIUJ6Bp5IGzNB0.png"/>
+            <a:graphic>
+              <a:graphicData uri="http://schemas.openxmlformats.org/drawingml/2006/picture">
+                <pic:pic>
+                  <pic:nvPicPr>
+                    <pic:cNvPr id="5" name="image-scZbTrQqIUJ6Bp5IGzNB0.png" descr="新增-实例列表新增"/>
+                    <pic:cNvPicPr/>
+                  </pic:nvPicPr>
+                  <pic:blipFill>
+                    <a:blip r:embed="rId10" cstate="print"/>
+                    <a:srcRect b="0" l="0" r="0" t="0"/>
+                    <a:stretch>
+                      <a:fillRect/>
+                    </a:stretch>
+                  </pic:blipFill>
+                  <pic:spPr>
+                    <a:xfrm>
+                      <a:off x="0" y="0"/>
+                      <a:ext cx="5753100" cy="2753697"/>
+                    </a:xfrm>
+                    <a:prstGeom prst="rect"/>
+                  </pic:spPr>
+                </pic:pic>
+              </a:graphicData>
+            </a:graphic>
+          </wp:inline>
+        </w:drawing>
+      </w:r>
+    </w:p>
+    <w:p>
+      <w:pPr>
+        <w:spacing w:line="240" w:before="0" w:after="0" w:lineRule="auto"/>
+      </w:pPr>
+      <w:r>
+        <w:rPr/>
+        <w:drawing>
+          <wp:inline distB="0" distL="0" distR="0" distT="0">
+            <wp:extent cx="5753100" cy="2753697"/>
+            <wp:effectExtent b="0" l="0" r="0" t="0"/>
+            <wp:docPr id="6" name="image-ftpLQjf6dPppo41aDzKni.png"/>
+            <a:graphic>
+              <a:graphicData uri="http://schemas.openxmlformats.org/drawingml/2006/picture">
+                <pic:pic>
+                  <pic:nvPicPr>
+                    <pic:cNvPr id="6" name="image-ftpLQjf6dPppo41aDzKni.png" descr="新增-填写信息保存"/>
+                    <pic:cNvPicPr/>
+                  </pic:nvPicPr>
+                  <pic:blipFill>
+                    <a:blip r:embed="rId11" cstate="print"/>
+                    <a:srcRect b="0" l="0" r="0" t="0"/>
+                    <a:stretch>
+                      <a:fillRect/>
+                    </a:stretch>
+                  </pic:blipFill>
+                  <pic:spPr>
+                    <a:xfrm>
+                      <a:off x="0" y="0"/>
+                      <a:ext cx="5753100" cy="2753697"/>
+                    </a:xfrm>
+                    <a:prstGeom prst="rect"/>
+                  </pic:spPr>
+                </pic:pic>
+              </a:graphicData>
+            </a:graphic>
+          </wp:inline>
+        </w:drawing>
+      </w:r>
+    </w:p>
+    <w:p>
+      <w:pPr>
+        <w:spacing w:line="240" w:before="0" w:after="0" w:lineRule="auto"/>
+      </w:pPr>
+      <w:r>
+        <w:rPr/>
+        <w:drawing>
+          <wp:inline distB="0" distL="0" distR="0" distT="0">
+            <wp:extent cx="5753100" cy="2753697"/>
+            <wp:effectExtent b="0" l="0" r="0" t="0"/>
+            <wp:docPr id="7" name="image-V0jpxnkPh4RbQruqcPqE_.png"/>
+            <a:graphic>
+              <a:graphicData uri="http://schemas.openxmlformats.org/drawingml/2006/picture">
+                <pic:pic>
+                  <pic:nvPicPr>
+                    <pic:cNvPr id="7" name="image-V0jpxnkPh4RbQruqcPqE_.png" descr="新增-填写信息保存（续）"/>
+                    <pic:cNvPicPr/>
+                  </pic:nvPicPr>
+                  <pic:blipFill>
+                    <a:blip r:embed="rId12" cstate="print"/>
+                    <a:srcRect b="0" l="0" r="0" t="0"/>
+                    <a:stretch>
+                      <a:fillRect/>
+                    </a:stretch>
+                  </pic:blipFill>
+                  <pic:spPr>
+                    <a:xfrm>
+                      <a:off x="0" y="0"/>
+                      <a:ext cx="5753100" cy="2753697"/>
+                    </a:xfrm>
+                    <a:prstGeom prst="rect"/>
+                  </pic:spPr>
+                </pic:pic>
+              </a:graphicData>
+            </a:graphic>
+          </wp:inline>
+        </w:drawing>
+      </w:r>
+    </w:p>
+    <w:p>
+      <w:pPr>
+        <w:spacing w:line="240" w:before="0" w:after="0" w:lineRule="auto"/>
+      </w:pPr>
+      <w:r>
+        <w:rPr/>
+        <w:drawing>
+          <wp:inline distB="0" distL="0" distR="0" distT="0">
+            <wp:extent cx="5753100" cy="2753697"/>
+            <wp:effectExtent b="0" l="0" r="0" t="0"/>
+            <wp:docPr id="8" name="image-y2CpfI9LgWRiOBxwEloEr.png"/>
+            <a:graphic>
+              <a:graphicData uri="http://schemas.openxmlformats.org/drawingml/2006/picture">
+                <pic:pic>
+                  <pic:nvPicPr>
+                    <pic:cNvPr id="8" name="image-y2CpfI9LgWRiOBxwEloEr.png" descr="新增-保存成功"/>
+                    <pic:cNvPicPr/>
+                  </pic:nvPicPr>
+                  <pic:blipFill>
+                    <a:blip r:embed="rId13" cstate="print"/>
+                    <a:srcRect b="0" l="0" r="0" t="0"/>
+                    <a:stretch>
+                      <a:fillRect/>
+                    </a:stretch>
+                  </pic:blipFill>
+                  <pic:spPr>
+                    <a:xfrm>
+                      <a:off x="0" y="0"/>
+                      <a:ext cx="5753100" cy="2753697"/>
+                    </a:xfrm>
+                    <a:prstGeom prst="rect"/>
+                  </pic:spPr>
+                </pic:pic>
+              </a:graphicData>
+            </a:graphic>
+          </wp:inline>
+        </w:drawing>
+      </w:r>
+    </w:p>
+    <w:p>
+      <w:pPr>
+        <w:spacing w:line="240" w:before="0" w:after="0" w:lineRule="auto"/>
+      </w:pPr>
+      <w:r>
+        <w:rPr/>
+        <w:drawing>
+          <wp:inline distB="0" distL="0" distR="0" distT="0">
+            <wp:extent cx="5753100" cy="2753697"/>
+            <wp:effectExtent b="0" l="0" r="0" t="0"/>
+            <wp:docPr id="9" name="image-Fe5E6dTKcbAI7pRFNeAA6.png"/>
+            <a:graphic>
+              <a:graphicData uri="http://schemas.openxmlformats.org/drawingml/2006/picture">
+                <pic:pic>
+                  <pic:nvPicPr>
+                    <pic:cNvPr id="9" name="image-Fe5E6dTKcbAI7pRFNeAA6.png" descr="新增-填写信息保存（续2）"/>
+                    <pic:cNvPicPr/>
+                  </pic:nvPicPr>
+                  <pic:blipFill>
+                    <a:blip r:embed="rId14" cstate="print"/>
+                    <a:srcRect b="0" l="0" r="0" t="0"/>
+                    <a:stretch>
+                      <a:fillRect/>
+                    </a:stretch>
+                  </pic:blipFill>
+                  <pic:spPr>
+                    <a:xfrm>
+                      <a:off x="0" y="0"/>
+                      <a:ext cx="5753100" cy="2753697"/>
+                    </a:xfrm>
+                    <a:prstGeom prst="rect"/>
+                  </pic:spPr>
+                </pic:pic>
+              </a:graphicData>
+            </a:graphic>
+          </wp:inline>
+        </w:drawing>
+      </w:r>
+    </w:p>
+    <w:p>
+      <w:pPr>
+        <w:spacing w:line="240" w:before="0" w:after="0" w:lineRule="auto"/>
+      </w:pPr>
+      <w:r>
+        <w:rPr/>
+        <w:drawing>
+          <wp:inline distB="0" distL="0" distR="0" distT="0">
+            <wp:extent cx="5753100" cy="2753697"/>
+            <wp:effectExtent b="0" l="0" r="0" t="0"/>
+            <wp:docPr id="10" name="image-5bu3C1hue5y-ZmCio1k6Z.png"/>
+            <a:graphic>
+              <a:graphicData uri="http://schemas.openxmlformats.org/drawingml/2006/picture">
+                <pic:pic>
+                  <pic:nvPicPr>
+                    <pic:cNvPr id="10" name="image-5bu3C1hue5y-ZmCio1k6Z.png" descr="新增-定时任务列表"/>
+                    <pic:cNvPicPr/>
+                  </pic:nvPicPr>
+                  <pic:blipFill>
+                    <a:blip r:embed="rId15" cstate="print"/>
+                    <a:srcRect b="0" l="0" r="0" t="0"/>
+                    <a:stretch>
+                      <a:fillRect/>
+                    </a:stretch>
+                  </pic:blipFill>
+                  <pic:spPr>
+                    <a:xfrm>
+                      <a:off x="0" y="0"/>
+                      <a:ext cx="5753100" cy="2753697"/>
+                    </a:xfrm>
+                    <a:prstGeom prst="rect"/>
+                  </pic:spPr>
+                </pic:pic>
+              </a:graphicData>
+            </a:graphic>
+          </wp:inline>
+        </w:drawing>
+      </w:r>
+    </w:p>
+    <w:p>
+      <w:pPr>
+        <w:spacing w:line="240" w:before="0" w:after="0" w:lineRule="auto"/>
+      </w:pPr>
+      <w:r>
+        <w:rPr/>
+        <w:drawing>
+          <wp:inline distB="0" distL="0" distR="0" distT="0">
+            <wp:extent cx="5753100" cy="2753697"/>
+            <wp:effectExtent b="0" l="0" r="0" t="0"/>
+            <wp:docPr id="11" name="image-5O4c0jtviybi09L8VLFuN.png"/>
+            <a:graphic>
+              <a:graphicData uri="http://schemas.openxmlformats.org/drawingml/2006/picture">
+                <pic:pic>
+                  <pic:nvPicPr>
+                    <pic:cNvPr id="11" name="image-5O4c0jtviybi09L8VLFuN.png" descr="新增-立即执行"/>
+                    <pic:cNvPicPr/>
+                  </pic:nvPicPr>
+                  <pic:blipFill>
+                    <a:blip r:embed="rId16" cstate="print"/>
+                    <a:srcRect b="0" l="0" r="0" t="0"/>
+                    <a:stretch>
+                      <a:fillRect/>
+                    </a:stretch>
+                  </pic:blipFill>
+                  <pic:spPr>
+                    <a:xfrm>
+                      <a:off x="0" y="0"/>
+                      <a:ext cx="5753100" cy="2753697"/>
+                    </a:xfrm>
+                    <a:prstGeom prst="rect"/>
+                  </pic:spPr>
+                </pic:pic>
+              </a:graphicData>
+            </a:graphic>
+          </wp:inline>
+        </w:drawing>
+      </w:r>
+    </w:p>
+    <w:p>
+      <w:pPr>
+        <w:spacing w:lineRule="auto"/>
+      </w:pPr>
+      <w:r>
+        <w:rPr>
+          <w:b/>
+        </w:rPr>
+        <w:t xml:space="preserve">人行管理平台侧</w:t>
+      </w:r>
+      <w:r>
+        <w:rPr/>
+        <w:t xml:space="preserve">——查看上报批次组、提交报送入库申请、确认结果：</w:t>
+      </w:r>
+    </w:p>
+    <w:p>
+      <w:pPr>
+        <w:spacing w:line="240" w:before="0" w:after="0" w:lineRule="auto"/>
+      </w:pPr>
+      <w:r>
+        <w:rPr/>
+        <w:drawing>
+          <wp:inline distB="0" distL="0" distR="0" distT="0">
+            <wp:extent cx="5753100" cy="2753697"/>
+            <wp:effectExtent b="0" l="0" r="0" t="0"/>
+            <wp:docPr id="12" name="image-gEHscBc8U4foLbd6Tyhgi.png"/>
+            <a:graphic>
+              <a:graphicData uri="http://schemas.openxmlformats.org/drawingml/2006/picture">
+                <pic:pic>
+                  <pic:nvPicPr>
+                    <pic:cNvPr id="12" name="image-gEHscBc8U4foLbd6Tyhgi.png" descr="人行平台-上报批次组"/>
+                    <pic:cNvPicPr/>
+                  </pic:nvPicPr>
+                  <pic:blipFill>
+                    <a:blip r:embed="rId17" cstate="print"/>
+                    <a:srcRect b="0" l="0" r="0" t="0"/>
+                    <a:stretch>
+                      <a:fillRect/>
+                    </a:stretch>
+                  </pic:blipFill>
+                  <pic:spPr>
+                    <a:xfrm>
+                      <a:off x="0" y="0"/>
+                      <a:ext cx="5753100" cy="2753697"/>
+                    </a:xfrm>
+                    <a:prstGeom prst="rect"/>
+                  </pic:spPr>
+                </pic:pic>
+              </a:graphicData>
+            </a:graphic>
+          </wp:inline>
+        </w:drawing>
+      </w:r>
+    </w:p>
+    <w:p>
+      <w:pPr>
+        <w:spacing w:line="240" w:before="0" w:after="0" w:lineRule="auto"/>
+      </w:pPr>
+      <w:r>
+        <w:rPr/>
+        <w:drawing>
+          <wp:inline distB="0" distL="0" distR="0" distT="0">
+            <wp:extent cx="5753100" cy="2753697"/>
+            <wp:effectExtent b="0" l="0" r="0" t="0"/>
+            <wp:docPr id="13" name="image-USOJtJ1q0OXghO8iDHVfq.png"/>
+            <a:graphic>
+              <a:graphicData uri="http://schemas.openxmlformats.org/drawingml/2006/picture">
+                <pic:pic>
+                  <pic:nvPicPr>
+                    <pic:cNvPr id="13" name="image-USOJtJ1q0OXghO8iDHVfq.png" descr="人行平台-批次组详情"/>
+                    <pic:cNvPicPr/>
+                  </pic:nvPicPr>
+                  <pic:blipFill>
+                    <a:blip r:embed="rId18" cstate="print"/>
+                    <a:srcRect b="0" l="0" r="0" t="0"/>
+                    <a:stretch>
+                      <a:fillRect/>
+                    </a:stretch>
+                  </pic:blipFill>
+                  <pic:spPr>
+                    <a:xfrm>
+                      <a:off x="0" y="0"/>
+                      <a:ext cx="5753100" cy="2753697"/>
+                    </a:xfrm>
+                    <a:prstGeom prst="rect"/>
+                  </pic:spPr>
+                </pic:pic>
+              </a:graphicData>
+            </a:graphic>
+          </wp:inline>
+        </w:drawing>
+      </w:r>
+    </w:p>
+    <w:p>
+      <w:pPr>
+        <w:spacing w:line="240" w:before="0" w:after="0" w:lineRule="auto"/>
+      </w:pPr>
+      <w:r>
+        <w:rPr/>
+        <w:drawing>
+          <wp:inline distB="0" distL="0" distR="0" distT="0">
+            <wp:extent cx="5753100" cy="2753697"/>
+            <wp:effectExtent b="0" l="0" r="0" t="0"/>
+            <wp:docPr id="14" name="image-h-KBtiRE-fLqNqQi_XjUO.png"/>
+            <a:graphic>
+              <a:graphicData uri="http://schemas.openxmlformats.org/drawingml/2006/picture">
+                <pic:pic>
+                  <pic:nvPicPr>
+                    <pic:cNvPr id="14" name="image-h-KBtiRE-fLqNqQi_XjUO.png" descr="人行平台-提交入库申请"/>
+                    <pic:cNvPicPr/>
+                  </pic:nvPicPr>
+                  <pic:blipFill>
+                    <a:blip r:embed="rId19" cstate="print"/>
+                    <a:srcRect b="0" l="0" r="0" t="0"/>
+                    <a:stretch>
+                      <a:fillRect/>
+                    </a:stretch>
+                  </pic:blipFill>
+                  <pic:spPr>
+                    <a:xfrm>
+                      <a:off x="0" y="0"/>
+                      <a:ext cx="5753100" cy="2753697"/>
+                    </a:xfrm>
+                    <a:prstGeom prst="rect"/>
+                  </pic:spPr>
+                </pic:pic>
+              </a:graphicData>
+            </a:graphic>
+          </wp:inline>
+        </w:drawing>
+      </w:r>
+    </w:p>
+    <w:p>
+      <w:pPr>
+        <w:spacing w:line="240" w:before="0" w:after="0" w:lineRule="auto"/>
+      </w:pPr>
+      <w:r>
+        <w:rPr/>
+        <w:drawing>
+          <wp:inline distB="0" distL="0" distR="0" distT="0">
+            <wp:extent cx="5753100" cy="2753697"/>
+            <wp:effectExtent b="0" l="0" r="0" t="0"/>
+            <wp:docPr id="15" name="image-iGlDgTt8RCc1ttSxi8kQ-.png"/>
+            <a:graphic>
+              <a:graphicData uri="http://schemas.openxmlformats.org/drawingml/2006/picture">
+                <pic:pic>
+                  <pic:nvPicPr>
+                    <pic:cNvPr id="15" name="image-iGlDgTt8RCc1ttSxi8kQ-.png" descr="人行平台-提交入库申请（续）"/>
+                    <pic:cNvPicPr/>
+                  </pic:nvPicPr>
+                  <pic:blipFill>
+                    <a:blip r:embed="rId20" cstate="print"/>
+                    <a:srcRect b="0" l="0" r="0" t="0"/>
+                    <a:stretch>
+                      <a:fillRect/>
+                    </a:stretch>
+                  </pic:blipFill>
+                  <pic:spPr>
+                    <a:xfrm>
+                      <a:off x="0" y="0"/>
+                      <a:ext cx="5753100" cy="2753697"/>
+                    </a:xfrm>
+                    <a:prstGeom prst="rect"/>
+                  </pic:spPr>
+                </pic:pic>
+              </a:graphicData>
+            </a:graphic>
+          </wp:inline>
+        </w:drawing>
+      </w:r>
+    </w:p>
+    <w:p>
+      <w:pPr>
+        <w:spacing w:line="240" w:before="0" w:after="0" w:lineRule="auto"/>
+      </w:pPr>
+      <w:r>
+        <w:rPr/>
+        <w:drawing>
+          <wp:inline distB="0" distL="0" distR="0" distT="0">
+            <wp:extent cx="5753100" cy="2753697"/>
+            <wp:effectExtent b="0" l="0" r="0" t="0"/>
+            <wp:docPr id="16" name="image-6u2iycn6PUOqd9D8t7WF2.png"/>
+            <a:graphic>
+              <a:graphicData uri="http://schemas.openxmlformats.org/drawingml/2006/picture">
+                <pic:pic>
+                  <pic:nvPicPr>
+                    <pic:cNvPr id="16" name="image-6u2iycn6PUOqd9D8t7WF2.png" descr="人行平台-处理结果"/>
+                    <pic:cNvPicPr/>
+                  </pic:nvPicPr>
+                  <pic:blipFill>
+                    <a:blip r:embed="rId21" cstate="print"/>
+                    <a:srcRect b="0" l="0" r="0" t="0"/>
+                    <a:stretch>
+                      <a:fillRect/>
+                    </a:stretch>
+                  </pic:blipFill>
+                  <pic:spPr>
+                    <a:xfrm>
+                      <a:off x="0" y="0"/>
+                      <a:ext cx="5753100" cy="2753697"/>
+                    </a:xfrm>
+                    <a:prstGeom prst="rect"/>
+                  </pic:spPr>
+                </pic:pic>
+              </a:graphicData>
+            </a:graphic>
+          </wp:inline>
+        </w:drawing>
+      </w:r>
+    </w:p>
+    <w:p>
+      <w:pPr>
+        <w:spacing w:line="240" w:before="0" w:after="0" w:lineRule="auto"/>
+      </w:pPr>
+      <w:r>
+        <w:rPr/>
+        <w:drawing>
+          <wp:inline distB="0" distL="0" distR="0" distT="0">
+            <wp:extent cx="5753100" cy="2753697"/>
+            <wp:effectExtent b="0" l="0" r="0" t="0"/>
+            <wp:docPr id="17" name="image-adjS3qdjHJ4wX9XVb2tmY.png"/>
+            <a:graphic>
+              <a:graphicData uri="http://schemas.openxmlformats.org/drawingml/2006/picture">
+                <pic:pic>
+                  <pic:nvPicPr>
+                    <pic:cNvPr id="17" name="image-adjS3qdjHJ4wX9XVb2tmY.png" descr="人行平台-确认上报结果"/>
+                    <pic:cNvPicPr/>
+                  </pic:nvPicPr>
+                  <pic:blipFill>
+                    <a:blip r:embed="rId22" cstate="print"/>
+                    <a:srcRect b="0" l="0" r="0" t="0"/>
+                    <a:stretch>
+                      <a:fillRect/>
+                    </a:stretch>
+                  </pic:blipFill>
+                  <pic:spPr>
+                    <a:xfrm>
+                      <a:off x="0" y="0"/>
+                      <a:ext cx="5753100" cy="2753697"/>
+                    </a:xfrm>
+                    <a:prstGeom prst="rect"/>
+                  </pic:spPr>
+                </pic:pic>
+              </a:graphicData>
+            </a:graphic>
+          </wp:inline>
+        </w:drawing>
+      </w:r>
+    </w:p>
+    <w:p>
+      <w:pPr>
         <w:pStyle w:val="Heading3"/>
         <w:numPr>
           <w:ilvl w:val="2"/>
@@ -1462,6 +2140,84 @@
     </w:p>
     <w:p>
       <w:pPr>
+        <w:spacing w:line="240" w:before="0" w:after="0" w:lineRule="auto"/>
+      </w:pPr>
+      <w:r>
+        <w:rPr/>
+        <w:drawing>
+          <wp:inline distB="0" distL="0" distR="0" distT="0">
+            <wp:extent cx="5753100" cy="2753697"/>
+            <wp:effectExtent b="0" l="0" r="0" t="0"/>
+            <wp:docPr id="18" name="image-ahCKDQQNLrj0vGV_D3cUF.png"/>
+            <a:graphic>
+              <a:graphicData uri="http://schemas.openxmlformats.org/drawingml/2006/picture">
+                <pic:pic>
+                  <pic:nvPicPr>
+                    <pic:cNvPr id="18" name="image-ahCKDQQNLrj0vGV_D3cUF.png" descr="修改-实例编辑"/>
+                    <pic:cNvPicPr/>
+                  </pic:nvPicPr>
+                  <pic:blipFill>
+                    <a:blip r:embed="rId23" cstate="print"/>
+                    <a:srcRect b="0" l="0" r="0" t="0"/>
+                    <a:stretch>
+                      <a:fillRect/>
+                    </a:stretch>
+                  </pic:blipFill>
+                  <pic:spPr>
+                    <a:xfrm>
+                      <a:off x="0" y="0"/>
+                      <a:ext cx="5753100" cy="2753697"/>
+                    </a:xfrm>
+                    <a:prstGeom prst="rect"/>
+                  </pic:spPr>
+                </pic:pic>
+              </a:graphicData>
+            </a:graphic>
+          </wp:inline>
+        </w:drawing>
+      </w:r>
+    </w:p>
+    <w:p>
+      <w:pPr>
+        <w:spacing w:line="240" w:before="0" w:after="0" w:lineRule="auto"/>
+      </w:pPr>
+      <w:r>
+        <w:rPr/>
+        <w:drawing>
+          <wp:inline distB="0" distL="0" distR="0" distT="0">
+            <wp:extent cx="5753100" cy="2753697"/>
+            <wp:effectExtent b="0" l="0" r="0" t="0"/>
+            <wp:docPr id="19" name="image-Dpo2iTvy_YPV6fvf0fuWP.png"/>
+            <a:graphic>
+              <a:graphicData uri="http://schemas.openxmlformats.org/drawingml/2006/picture">
+                <pic:pic>
+                  <pic:nvPicPr>
+                    <pic:cNvPr id="19" name="image-Dpo2iTvy_YPV6fvf0fuWP.png" descr="修改-审批查看结果"/>
+                    <pic:cNvPicPr/>
+                  </pic:nvPicPr>
+                  <pic:blipFill>
+                    <a:blip r:embed="rId24" cstate="print"/>
+                    <a:srcRect b="0" l="0" r="0" t="0"/>
+                    <a:stretch>
+                      <a:fillRect/>
+                    </a:stretch>
+                  </pic:blipFill>
+                  <pic:spPr>
+                    <a:xfrm>
+                      <a:off x="0" y="0"/>
+                      <a:ext cx="5753100" cy="2753697"/>
+                    </a:xfrm>
+                    <a:prstGeom prst="rect"/>
+                  </pic:spPr>
+                </pic:pic>
+              </a:graphicData>
+            </a:graphic>
+          </wp:inline>
+        </w:drawing>
+      </w:r>
+    </w:p>
+    <w:p>
+      <w:pPr>
         <w:spacing w:lineRule="auto"/>
       </w:pPr>
       <w:r>
@@ -1603,6 +2359,123 @@
       </w:pPr>
       <w:r>
         <w:rPr/>
+      </w:r>
+    </w:p>
+    <w:p>
+      <w:pPr>
+        <w:spacing w:line="240" w:before="0" w:after="0" w:lineRule="auto"/>
+      </w:pPr>
+      <w:r>
+        <w:rPr/>
+        <w:drawing>
+          <wp:inline distB="0" distL="0" distR="0" distT="0">
+            <wp:extent cx="5753100" cy="2753697"/>
+            <wp:effectExtent b="0" l="0" r="0" t="0"/>
+            <wp:docPr id="20" name="image-nv3Tk2BIP0w2Zi_qVlT_3.png"/>
+            <a:graphic>
+              <a:graphicData uri="http://schemas.openxmlformats.org/drawingml/2006/picture">
+                <pic:pic>
+                  <pic:nvPicPr>
+                    <pic:cNvPr id="20" name="image-nv3Tk2BIP0w2Zi_qVlT_3.png" descr="删除-选择实例批量删除"/>
+                    <pic:cNvPicPr/>
+                  </pic:nvPicPr>
+                  <pic:blipFill>
+                    <a:blip r:embed="rId25" cstate="print"/>
+                    <a:srcRect b="0" l="0" r="0" t="0"/>
+                    <a:stretch>
+                      <a:fillRect/>
+                    </a:stretch>
+                  </pic:blipFill>
+                  <pic:spPr>
+                    <a:xfrm>
+                      <a:off x="0" y="0"/>
+                      <a:ext cx="5753100" cy="2753697"/>
+                    </a:xfrm>
+                    <a:prstGeom prst="rect"/>
+                  </pic:spPr>
+                </pic:pic>
+              </a:graphicData>
+            </a:graphic>
+          </wp:inline>
+        </w:drawing>
+      </w:r>
+    </w:p>
+    <w:p>
+      <w:pPr>
+        <w:spacing w:line="240" w:before="0" w:after="0" w:lineRule="auto"/>
+      </w:pPr>
+      <w:r>
+        <w:rPr/>
+        <w:drawing>
+          <wp:inline distB="0" distL="0" distR="0" distT="0">
+            <wp:extent cx="5753100" cy="2753697"/>
+            <wp:effectExtent b="0" l="0" r="0" t="0"/>
+            <wp:docPr id="21" name="image-FSdVvB55hf_kwwaz82F6Z.png"/>
+            <a:graphic>
+              <a:graphicData uri="http://schemas.openxmlformats.org/drawingml/2006/picture">
+                <pic:pic>
+                  <pic:nvPicPr>
+                    <pic:cNvPr id="21" name="image-FSdVvB55hf_kwwaz82F6Z.png" descr="删除-确认删除"/>
+                    <pic:cNvPicPr/>
+                  </pic:nvPicPr>
+                  <pic:blipFill>
+                    <a:blip r:embed="rId26" cstate="print"/>
+                    <a:srcRect b="0" l="0" r="0" t="0"/>
+                    <a:stretch>
+                      <a:fillRect/>
+                    </a:stretch>
+                  </pic:blipFill>
+                  <pic:spPr>
+                    <a:xfrm>
+                      <a:off x="0" y="0"/>
+                      <a:ext cx="5753100" cy="2753697"/>
+                    </a:xfrm>
+                    <a:prstGeom prst="rect"/>
+                  </pic:spPr>
+                </pic:pic>
+              </a:graphicData>
+            </a:graphic>
+          </wp:inline>
+        </w:drawing>
+      </w:r>
+    </w:p>
+    <w:p>
+      <w:pPr>
+        <w:spacing w:line="240" w:before="0" w:after="0" w:lineRule="auto"/>
+      </w:pPr>
+      <w:r>
+        <w:rPr/>
+        <w:drawing>
+          <wp:inline distB="0" distL="0" distR="0" distT="0">
+            <wp:extent cx="5753100" cy="2753697"/>
+            <wp:effectExtent b="0" l="0" r="0" t="0"/>
+            <wp:docPr id="22" name="image-CJhLu4siolivXQKmkbHZe.png"/>
+            <a:graphic>
+              <a:graphicData uri="http://schemas.openxmlformats.org/drawingml/2006/picture">
+                <pic:pic>
+                  <pic:nvPicPr>
+                    <pic:cNvPr id="22" name="image-CJhLu4siolivXQKmkbHZe.png" descr="删除-审批查看结果"/>
+                    <pic:cNvPicPr/>
+                  </pic:nvPicPr>
+                  <pic:blipFill>
+                    <a:blip r:embed="rId27" cstate="print"/>
+                    <a:srcRect b="0" l="0" r="0" t="0"/>
+                    <a:stretch>
+                      <a:fillRect/>
+                    </a:stretch>
+                  </pic:blipFill>
+                  <pic:spPr>
+                    <a:xfrm>
+                      <a:off x="0" y="0"/>
+                      <a:ext cx="5753100" cy="2753697"/>
+                    </a:xfrm>
+                    <a:prstGeom prst="rect"/>
+                  </pic:spPr>
+                </pic:pic>
+              </a:graphicData>
+            </a:graphic>
+          </wp:inline>
+        </w:drawing>
       </w:r>
     </w:p>
     <w:p>

</xml_diff>